<commit_message>
Complete exercises 1 check, 2 and 3 for SAD Sever
Co-authored-by: Gustorio <39494246+Gustorio@users.noreply.github.com>
</commit_message>
<xml_diff>
--- a/SAD_Sever_profil.docx
+++ b/SAD_Sever_profil.docx
@@ -817,18 +817,328 @@
       </w:r>
     </w:p>
     <w:p>
+      <w:pPr/>
       <w:r>
-        <w:t>Vstupy: cestujúci, samosprávy, dodávatelia, regulátor</w:t>
-      </w:r>
-      <w:r>
-        <w:br/>
-        <w:t>Hlavné procesy: doprava, dispečing, údržba, predaj lístkov, plánovanie</w:t>
-      </w:r>
-      <w:r>
-        <w:br/>
-        <w:t>Výstupy: prepravení cestujúci, dopravná obslužnosť regiónu, doplnkové dopravné služby</w:t>
+        <w:rPr>
+          <w:b w:val="0"/>
+        </w:rPr>
+        <w:t>Nasledujúci diagram zobrazuje základnú logiku organizácie SAD Sever, a. s.:</w:t>
       </w:r>
     </w:p>
+    <w:tbl>
+      <w:tblPr>
+        <w:tblStyle w:val="Mriekatabuky"/>
+        <w:tblW w:type="auto" w:w="0"/>
+        <w:tblLook w:firstColumn="1" w:firstRow="1" w:lastColumn="0" w:lastRow="0" w:noHBand="0" w:noVBand="1" w:val="04A0"/>
+      </w:tblPr>
+      <w:tblGrid>
+        <w:gridCol w:w="2880"/>
+        <w:gridCol w:w="2880"/>
+        <w:gridCol w:w="2880"/>
+      </w:tblGrid>
+      <w:tr>
+        <w:tc>
+          <w:tcPr>
+            <w:tcW w:type="dxa" w:w="2880"/>
+            <w:shd w:val="clear" w:color="auto" w:fill="4472C4"/>
+          </w:tcPr>
+          <w:p>
+            <w:pPr>
+              <w:jc w:val="center"/>
+            </w:pPr>
+            <w:r>
+              <w:rPr>
+                <w:b/>
+                <w:color w:val="FFFFFF"/>
+              </w:rPr>
+              <w:t>VSTUPY</w:t>
+            </w:r>
+          </w:p>
+        </w:tc>
+        <w:tc>
+          <w:tcPr>
+            <w:tcW w:type="dxa" w:w="2880"/>
+            <w:shd w:val="clear" w:color="auto" w:fill="4472C4"/>
+          </w:tcPr>
+          <w:p>
+            <w:pPr>
+              <w:jc w:val="center"/>
+            </w:pPr>
+            <w:r>
+              <w:rPr>
+                <w:b/>
+                <w:color w:val="FFFFFF"/>
+              </w:rPr>
+              <w:t>HLAVNÉ PROCESY</w:t>
+            </w:r>
+          </w:p>
+        </w:tc>
+        <w:tc>
+          <w:tcPr>
+            <w:tcW w:type="dxa" w:w="2880"/>
+            <w:shd w:val="clear" w:color="auto" w:fill="4472C4"/>
+          </w:tcPr>
+          <w:p>
+            <w:pPr>
+              <w:jc w:val="center"/>
+            </w:pPr>
+            <w:r>
+              <w:rPr>
+                <w:b/>
+                <w:color w:val="FFFFFF"/>
+              </w:rPr>
+              <w:t>VÝSTUPY</w:t>
+            </w:r>
+          </w:p>
+        </w:tc>
+      </w:tr>
+      <w:tr>
+        <w:tc>
+          <w:tcPr>
+            <w:tcW w:type="dxa" w:w="2880"/>
+          </w:tcPr>
+          <w:p>
+            <w:pPr>
+              <w:jc w:val="left"/>
+            </w:pPr>
+            <w:r>
+              <w:t>Cestujúci (požiadavka na prepravu)</w:t>
+            </w:r>
+          </w:p>
+        </w:tc>
+        <w:tc>
+          <w:tcPr>
+            <w:tcW w:type="dxa" w:w="2880"/>
+          </w:tcPr>
+          <w:p>
+            <w:pPr>
+              <w:jc w:val="left"/>
+            </w:pPr>
+            <w:r>
+              <w:t>P1 – Poskytovanie autobusovej dopravy</w:t>
+            </w:r>
+          </w:p>
+        </w:tc>
+        <w:tc>
+          <w:tcPr>
+            <w:tcW w:type="dxa" w:w="2880"/>
+          </w:tcPr>
+          <w:p>
+            <w:pPr>
+              <w:jc w:val="left"/>
+            </w:pPr>
+            <w:r>
+              <w:t>Prepravení cestujúci</w:t>
+            </w:r>
+          </w:p>
+        </w:tc>
+      </w:tr>
+      <w:tr>
+        <w:tc>
+          <w:tcPr>
+            <w:tcW w:type="dxa" w:w="2880"/>
+          </w:tcPr>
+          <w:p>
+            <w:pPr>
+              <w:jc w:val="left"/>
+            </w:pPr>
+            <w:r>
+              <w:t>Samosprávy / VÚC (objednávky liniek)</w:t>
+            </w:r>
+          </w:p>
+        </w:tc>
+        <w:tc>
+          <w:tcPr>
+            <w:tcW w:type="dxa" w:w="2880"/>
+          </w:tcPr>
+          <w:p>
+            <w:pPr>
+              <w:jc w:val="left"/>
+            </w:pPr>
+            <w:r>
+              <w:t>P2 – Riadenie prevádzky (dispečing)</w:t>
+            </w:r>
+          </w:p>
+        </w:tc>
+        <w:tc>
+          <w:tcPr>
+            <w:tcW w:type="dxa" w:w="2880"/>
+          </w:tcPr>
+          <w:p>
+            <w:pPr>
+              <w:jc w:val="left"/>
+            </w:pPr>
+            <w:r>
+              <w:t>Dopravná obslužnosť regiónu</w:t>
+            </w:r>
+          </w:p>
+        </w:tc>
+      </w:tr>
+      <w:tr>
+        <w:tc>
+          <w:tcPr>
+            <w:tcW w:type="dxa" w:w="2880"/>
+          </w:tcPr>
+          <w:p>
+            <w:pPr>
+              <w:jc w:val="left"/>
+            </w:pPr>
+            <w:r>
+              <w:t>Dodávatelia paliva a dielov</w:t>
+            </w:r>
+          </w:p>
+        </w:tc>
+        <w:tc>
+          <w:tcPr>
+            <w:tcW w:type="dxa" w:w="2880"/>
+          </w:tcPr>
+          <w:p>
+            <w:pPr>
+              <w:jc w:val="left"/>
+            </w:pPr>
+            <w:r>
+              <w:t>P3 – Údržba vozidiel</w:t>
+            </w:r>
+          </w:p>
+        </w:tc>
+        <w:tc>
+          <w:tcPr>
+            <w:tcW w:type="dxa" w:w="2880"/>
+          </w:tcPr>
+          <w:p>
+            <w:pPr>
+              <w:jc w:val="left"/>
+            </w:pPr>
+            <w:r>
+              <w:t>Koordinované spoje</w:t>
+            </w:r>
+          </w:p>
+        </w:tc>
+      </w:tr>
+      <w:tr>
+        <w:tc>
+          <w:tcPr>
+            <w:tcW w:type="dxa" w:w="2880"/>
+          </w:tcPr>
+          <w:p>
+            <w:pPr>
+              <w:jc w:val="left"/>
+            </w:pPr>
+            <w:r>
+              <w:t>Regulátor dopravy (licencie)</w:t>
+            </w:r>
+          </w:p>
+        </w:tc>
+        <w:tc>
+          <w:tcPr>
+            <w:tcW w:type="dxa" w:w="2880"/>
+          </w:tcPr>
+          <w:p>
+            <w:pPr>
+              <w:jc w:val="left"/>
+            </w:pPr>
+            <w:r>
+              <w:t>P4 – Predaj cestovných lístkov</w:t>
+            </w:r>
+          </w:p>
+        </w:tc>
+        <w:tc>
+          <w:tcPr>
+            <w:tcW w:type="dxa" w:w="2880"/>
+          </w:tcPr>
+          <w:p>
+            <w:pPr>
+              <w:jc w:val="left"/>
+            </w:pPr>
+            <w:r>
+              <w:t>Tržby z predaja lístkov</w:t>
+            </w:r>
+          </w:p>
+        </w:tc>
+      </w:tr>
+      <w:tr>
+        <w:tc>
+          <w:tcPr>
+            <w:tcW w:type="dxa" w:w="2880"/>
+          </w:tcPr>
+          <w:p>
+            <w:pPr>
+              <w:jc w:val="left"/>
+            </w:pPr>
+            <w:r>
+              <w:t>IT dodávateľ (systémy)</w:t>
+            </w:r>
+          </w:p>
+        </w:tc>
+        <w:tc>
+          <w:tcPr>
+            <w:tcW w:type="dxa" w:w="2880"/>
+          </w:tcPr>
+          <w:p>
+            <w:pPr>
+              <w:jc w:val="left"/>
+            </w:pPr>
+            <w:r>
+              <w:t>P5 – Plánovanie trás a grafikonu</w:t>
+            </w:r>
+          </w:p>
+        </w:tc>
+        <w:tc>
+          <w:tcPr>
+            <w:tcW w:type="dxa" w:w="2880"/>
+          </w:tcPr>
+          <w:p>
+            <w:pPr>
+              <w:jc w:val="left"/>
+            </w:pPr>
+            <w:r>
+              <w:t>Optimalizované linky</w:t>
+            </w:r>
+          </w:p>
+        </w:tc>
+      </w:tr>
+      <w:tr>
+        <w:tc>
+          <w:tcPr>
+            <w:tcW w:type="dxa" w:w="2880"/>
+          </w:tcPr>
+          <w:p>
+            <w:pPr>
+              <w:jc w:val="left"/>
+            </w:pPr>
+            <w:r>
+              <w:t>Servisní partneri (opravy)</w:t>
+            </w:r>
+          </w:p>
+        </w:tc>
+        <w:tc>
+          <w:tcPr>
+            <w:tcW w:type="dxa" w:w="2880"/>
+          </w:tcPr>
+          <w:p>
+            <w:pPr>
+              <w:jc w:val="left"/>
+            </w:pPr>
+            <w:r>
+              <w:t>P6/P7 – Zákaznícka podpora / Zmluvná doprava</w:t>
+            </w:r>
+          </w:p>
+        </w:tc>
+        <w:tc>
+          <w:tcPr>
+            <w:tcW w:type="dxa" w:w="2880"/>
+          </w:tcPr>
+          <w:p>
+            <w:pPr>
+              <w:jc w:val="left"/>
+            </w:pPr>
+            <w:r>
+              <w:t>Doplnkové dopravné služby</w:t>
+            </w:r>
+          </w:p>
+        </w:tc>
+      </w:tr>
+    </w:tbl>
     <w:sectPr>
       <w:pgSz w:w="12240" w:h="15840"/>
       <w:pgMar w:top="1440" w:right="1800" w:bottom="1440" w:left="1800" w:header="720" w:footer="720" w:gutter="0"/>

</xml_diff>